<commit_message>
feat: prepare standalone Render Free demo with runtime checks
</commit_message>
<xml_diff>
--- a/docs/4Next_document_de_lucru_hackathon.docx
+++ b/docs/4Next_document_de_lucru_hackathon.docx
@@ -162,7 +162,7 @@
               <w:spacing w:after="40" w:line="252" w:lineRule="auto"/>
             </w:pPr>
             <w:r>
-              <w:t>Prototip funcțional local cu conturi și studiu din surse</w:t>
+              <w:t>Prototip pregătit pentru demo Render Free</w:t>
             </w:r>
           </w:p>
         </w:tc>
@@ -797,7 +797,7 @@
         <w:ind w:left="317" w:hanging="173"/>
       </w:pPr>
       <w:r>
-        <w:t>Baza anterioară a trecut 52 de teste backend și a măsurat 89% acoperire pentru codul activ. Generatoarele legacy video/diagrame sunt excluse explicit. Testele folosesc baze temporare și furnizori simulați.</w:t>
+        <w:t>Sursa pregătită pentru Render a trecut 78/78 teste backend, cu 90% acoperire pentru codul activ, și 4/4 teste proxy frontend. Lint, TypeScript și build de producție trec. Generatoarele legacy video/diagrame sunt excluse explicit din acoperirea codului activ.</w:t>
       </w:r>
     </w:p>
     <w:p>
@@ -807,7 +807,7 @@
         <w:ind w:left="317" w:hanging="173"/>
       </w:pPr>
       <w:r>
-        <w:t>Ultima verificare anterioară a frontendului: lint fără erori sau avertismente, TypeScript și build de producție reușite. Browserul a fost verificat la 1440 și 390 px pentru fluxurile principale.</w:t>
+        <w:t>Verificările publice anterioare au confirmat autentificarea HTTPS, uploadul, exportul și chatul. Demo-ul Vercel a devenit indisponibil după sleep pe PC; echipa a decis mutarea întregii aplicații pe Render. Nu există încă un URL Render confirmat live.</w:t>
       </w:r>
     </w:p>
     <w:p>
@@ -817,7 +817,7 @@
         <w:ind w:left="317" w:hanging="173"/>
       </w:pPr>
       <w:r>
-        <w:t>Dezvoltarea curentă se face pe branch-ul flavius al repository-ului archimex2026/4next. La începutul acestei runde, commitul verificat era 1d7d45d, cu GitHub Actions reușit. Merge-ul și lansarea se consemnează după verificarea lor.</w:t>
+        <w:t>Configurația Render este pregătită în render.yaml și Dockerfile.render, cu supervisor pentru ambele procese. Schema oficială a trecut validarea locală. Noul job CI construiește și testează imaginea Docker după push; rezultatul lui și merge-ul pe main se confirmă separat.</w:t>
       </w:r>
     </w:p>
     <w:p>
@@ -841,7 +841,7 @@
         <w:widowControl/>
       </w:pPr>
       <w:r>
-        <w:t>Coșul de gunoi cu restaurare, ștergere definitivă și expirare după cinci zile este implementat și verificat prin teste. Exporturile PDF au fost reverificate. Pregătirea lansării continuă; starea publică și rezultatele finale se păstrează în README și checklist.</w:t>
+        <w:t>Coșul de gunoi cu restaurare, ștergere definitivă și expirare după cinci zile este implementat și testat. PDF-urile au fost reverificate. Lansarea Render Free este în pregătire, fără dependență de calculatorul echipei; URL-ul se distribuie după verificare.</w:t>
       </w:r>
     </w:p>
     <w:tbl>
@@ -1230,7 +1230,7 @@
               <w:spacing w:after="40" w:line="252" w:lineRule="auto"/>
             </w:pPr>
             <w:r>
-              <w:t>Finalizăm ștergerea în coș, restaurarea și curățarea după cinci zile, cu teste de acces.</w:t>
+              <w:t>Verificăm lansarea independentă de PC și mesajul despre resetarea datelor demo.</w:t>
             </w:r>
           </w:p>
         </w:tc>
@@ -1247,11 +1247,8 @@
             <w:shd w:fill="F2F5EF"/>
           </w:tcPr>
           <w:p>
-            <w:pPr>
-              <w:spacing w:after="40" w:line="252" w:lineRule="auto"/>
-            </w:pPr>
             <w:r>
-              <w:t>Previne pierderea accidentală a materialelor și revocă accesul public sau partajat cât timp materialul este în coș.</w:t>
+              <w:t>Elimină dependența de PC și explică limitele datelor temporare pe planul gratuit.</w:t>
             </w:r>
           </w:p>
         </w:tc>
@@ -1301,12 +1298,7 @@
               <w:spacing w:after="40" w:line="252" w:lineRule="auto"/>
             </w:pPr>
             <w:r>
-              <w:rPr>
-                <w:rFonts w:ascii="Arial" w:hAnsi="Arial"/>
-                <w:color w:val="25382F"/>
-                <w:sz w:val="18"/>
-              </w:rPr>
-              <w:t>Pregătim un demo public sau o înregistrare de rezervă și verificăm fiecare link.</w:t>
+              <w:t>Publicăm demo-ul Render după verificare și pregătim o înregistrare de rezervă.</w:t>
             </w:r>
           </w:p>
         </w:tc>
@@ -1697,7 +1689,7 @@
               <w:spacing w:after="40" w:line="252" w:lineRule="auto"/>
             </w:pPr>
             <w:r>
-              <w:t>Google Gemini API opțional, cu model configurabil din mediu. Un apel JSON real a confirmat funcționarea cheii în această rundă. Cheia rămâne secretă în backend și nu se publică în Git, frontend sau prezentare.</w:t>
+              <w:t>Google Gemini API opțional, cu model configurabil din mediu. Apel JSON real și upload cu generare ai_grounded verificate în această rundă. Cheia rămâne secretă în backend și nu se publică în Git, frontend sau prezentare.</w:t>
             </w:r>
           </w:p>
         </w:tc>
@@ -1799,7 +1791,7 @@
               <w:spacing w:after="40" w:line="252" w:lineRule="auto"/>
             </w:pPr>
             <w:r>
-              <w:t>GitHub pentru cod și verificări automate. Vercel este destinația interfeței, cu backend și date persistente care trebuie conectate și testate public. Canva este pentru etapa ulterioară de prezentare.</w:t>
+              <w:t>GitHub pentru cod și CI; Render Free pentru interfață și API într-un serviciu Docker, în pregătire. Date temporare, fără disc. Canva rămâne etapa ulterioară de prezentare.</w:t>
             </w:r>
           </w:p>
         </w:tc>
@@ -1855,10 +1847,7 @@
         <w:pStyle w:val="Heading2"/>
       </w:pPr>
       <w:r>
-        <w:rPr>
-          <w:color w:val="000000"/>
-        </w:rPr>
-        <w:t>Ce trebuie pregătit pentru publicare</w:t>
+        <w:t>Găzduirea demonstrației pe Render</w:t>
       </w:r>
     </w:p>
     <w:p>
@@ -1866,7 +1855,7 @@
         <w:widowControl/>
       </w:pPr>
       <w:r>
-        <w:t>Interfața poate rula pe Vercel, dar SQLite, sursele și media trebuie păstrate pe un backend cu stocare persistentă. Un filesystem temporar de funcție serverless nu este o bază sigură pentru conturile demo. Configurația trebuie să alinieze HTTPS, cookie Secure, SameSite, origini CORS și adresa publică a API-ului. Cheia Gemini se configurează ca secret în mediul backendului; configurarea ei numai în frontend nu activează API-ul Python.</w:t>
+        <w:t>Ținta este un singur serviciu Docker Render Free în Frankfurt. Next.js ascultă pe portul public, iar FastAPI numai pe loopback 8000 în container. Proxyul păstrează aceeași origine pentru pagină, API și cookie. Blueprintul folosește main și publicare manuală, fără disc sau plan cu plată. Cheia Gemini se introduce în Environment numai pentru backend; URL-ul și funcționarea publică se verifică după deploy.</w:t>
       </w:r>
     </w:p>
     <w:p>
@@ -1897,7 +1886,7 @@
         <w:ind w:left="317" w:hanging="173"/>
       </w:pPr>
       <w:r>
-        <w:t>Linkul public se anunță numai după verificarea paginii și a fluxului API cu autentificare, upload și export. Până atunci, localhost rămâne o adresă locală.</w:t>
+        <w:t>Render Free are date temporare: conturile, documentele și media de sub /var/data se pot pierde la restart, redeploy sau oprirea automată. După 15 minute fără trafic, primul acces ulterior poate necesita aproximativ un minut de pornire.</w:t>
       </w:r>
     </w:p>
     <w:p>
@@ -1958,7 +1947,7 @@
         <w:spacing w:after="100"/>
       </w:pPr>
       <w:r>
-        <w:t>Descrierea rămâne sub 300 de cuvinte. Linkul public și contribuțiile nominale se completează după confirmare.</w:t>
+        <w:t>Descrierea rămâne sub 300 de cuvinte. Linkul Render și contribuțiile nominale se completează după verificare și confirmarea echipei.</w:t>
       </w:r>
     </w:p>
     <w:p>
@@ -3140,7 +3129,7 @@
         <w:ind w:left="317" w:hanging="173"/>
       </w:pPr>
       <w:r>
-        <w:t>[ ] Decidem dacă demo-ul va fi publicat sau prezentat printr-o înregistrare de rezervă.</w:t>
+        <w:t>[ ] Verificăm demo-ul Render independent de PC și pregătim înregistrarea de rezervă.</w:t>
       </w:r>
     </w:p>
     <w:p>
@@ -3215,12 +3204,12 @@
     </w:p>
     <w:p>
       <w:r>
-        <w:t>Coșul cu restaurare, ștergere definitivă și expirare după cinci zile este implementat și testat. Lansarea publică și merge-ul se verifică în README și docs/brainstorming_implementare.md. Auditul celor 30 de puncte din plan este în docs/backend_architecture_audit.md; alternativele și funcțiile lipsă sunt marcate separat.</w:t>
+        <w:t>Coșul cu restaurare și expirare după cinci zile este implementat și testat. Auditul celor 30 de puncte păstrează alternativele și funcțiile lipsă. Starea deploymentului și merge-ul se verifică în README și în checklist; existența configurației nu dovedește o lansare reușită.</w:t>
       </w:r>
     </w:p>
     <w:p>
       <w:r>
-        <w:t>Adresa 4next.vercel.app nu este disponibilă. Alternativa 4next-study.vercel.app a fost rezervată și verificată. Demo-ul pregătit folosește un backend izolat pe portul local 18000, cu bază și fișiere separate și gateway protejat; API-ul obișnuit de pe 8000 nu este expus. Rezervarea adresei nu echivalează cu publicarea completă: fluxul public trebuie verificat înainte de distribuire.</w:t>
+        <w:t>Echipa a ales explicit Render Free și a acceptat resetarea datelor. Contul demo se creează manual și poate necesita recreare după reset, fără parolă publicată în Git. Găzduirea Vercel cu API pe PC rămâne istoric; noul URL Render se anunță numai după verificarea serviciului.</w:t>
       </w:r>
     </w:p>
     <w:sectPr>

</xml_diff>

<commit_message>
docs: sync Render status and project handoff
</commit_message>
<xml_diff>
--- a/docs/4Next_document_de_lucru_hackathon.docx
+++ b/docs/4Next_document_de_lucru_hackathon.docx
@@ -162,7 +162,7 @@
               <w:spacing w:after="40" w:line="252" w:lineRule="auto"/>
             </w:pPr>
             <w:r>
-              <w:t>Prototip pregătit pentru demo Render Free</w:t>
+              <w:t>Render Free Live și verificat în cloud</w:t>
             </w:r>
           </w:p>
         </w:tc>
@@ -797,7 +797,7 @@
         <w:ind w:left="317" w:hanging="173"/>
       </w:pPr>
       <w:r>
-        <w:t>Sursa pregătită pentru Render a trecut 78/78 teste backend, cu 90% acoperire pentru codul activ, și 4/4 teste proxy frontend. Lint, TypeScript și build de producție trec. Generatoarele legacy video/diagrame sunt excluse explicit din acoperirea codului activ.</w:t>
+        <w:t>Sursa pregătită pentru Render a trecut 78/78 teste backend, cu 90% acoperire pentru codul activ, și 5/5 teste proxy frontend. Lint, TypeScript și build de producție trec. Generatoarele legacy video/diagrame sunt excluse explicit din acoperirea codului activ.</w:t>
       </w:r>
     </w:p>
     <w:p>
@@ -807,7 +807,7 @@
         <w:ind w:left="317" w:hanging="173"/>
       </w:pPr>
       <w:r>
-        <w:t>Verificările publice anterioare au confirmat autentificarea HTTPS, uploadul, exportul și chatul. Demo-ul Vercel a devenit indisponibil după sleep pe PC; echipa a decis mutarea întregii aplicații pe Render. Nu există încă un URL Render confirmat live.</w:t>
+        <w:t>Vechiul demo Vercel a devenit indisponibil după sleep pe PC, astfel că echipa mută întreaga aplicație pe Render. URL-ul atribuit este https://fournext-study.onrender.com; deploymentul este încă în build, fără confirmare Live sau verificare publică.</w:t>
       </w:r>
     </w:p>
     <w:p>
@@ -817,7 +817,7 @@
         <w:ind w:left="317" w:hanging="173"/>
       </w:pPr>
       <w:r>
-        <w:t>Configurația Render este pregătită în render.yaml și Dockerfile.render, cu supervisor pentru ambele procese. Schema oficială a trecut validarea locală. Noul job CI construiește și testează imaginea Docker după push; rezultatul lui și merge-ul pe main se confirmă separat.</w:t>
+        <w:t>Configurația a trecut preview-ul Render, iar CI39066911100 a trecut backend, frontend și buildul Docker real cu smoke test pentru API, SQLite, catalog și PDF. Sursa este publicată pe main. Corecția proxyului permite până la 120 de secunde pentru analiză; redeployul și testul complet în cloud sunt în curs.</w:t>
       </w:r>
     </w:p>
     <w:p>
@@ -841,7 +841,7 @@
         <w:widowControl/>
       </w:pPr>
       <w:r>
-        <w:t>Coșul de gunoi cu restaurare, ștergere definitivă și expirare după cinci zile este implementat și testat. PDF-urile au fost reverificate. Lansarea Render Free este în pregătire, fără dependență de calculatorul echipei; URL-ul se distribuie după verificare.</w:t>
+        <w:t>Coșul de gunoi cu restaurare, ștergere definitivă și expirare după cinci zile este implementat și testat. PDF-urile au fost reverificate. Serviciul Render Free este creat și se construiește, fără backend pe PC; URL-ul se distribuie după verificare.</w:t>
       </w:r>
     </w:p>
     <w:tbl>
@@ -1791,7 +1791,7 @@
               <w:spacing w:after="40" w:line="252" w:lineRule="auto"/>
             </w:pPr>
             <w:r>
-              <w:t>GitHub pentru cod și CI; Render Free pentru interfață și API într-un serviciu Docker, în pregătire. Date temporare, fără disc. Canva rămâne etapa ulterioară de prezentare.</w:t>
+              <w:t>GitHub pentru cod și CI; sursa este integrată în main. Serviciu Render Free creat, cu deployment în build. Date temporare, fără disc. Canva rămâne etapa ulterioară.</w:t>
             </w:r>
           </w:p>
         </w:tc>
@@ -1855,7 +1855,7 @@
         <w:widowControl/>
       </w:pPr>
       <w:r>
-        <w:t>Ținta este un singur serviciu Docker Render Free în Frankfurt. Next.js ascultă pe portul public, iar FastAPI numai pe loopback 8000 în container. Proxyul păstrează aceeași origine pentru pagină, API și cookie. Blueprintul folosește main și publicare manuală, fără disc sau plan cu plată. Cheia Gemini se introduce în Environment numai pentru backend; URL-ul și funcționarea publică se verifică după deploy.</w:t>
+        <w:t>Serviciul Render Free din Frankfurt găzduiește Next.js public și FastAPI numai pe loopback 8000. Proxyul păstrează aceeași origine. Blueprintul folosește main și publicare manuală, fără disc sau plan cu plată. Cheia Gemini este configurată în Environment cu aprobarea utilizatorului; erorile furnizorului folosesc extragerea locală etichetată. Fluxul complet se verifică după redeploy.</w:t>
       </w:r>
     </w:p>
     <w:p>
@@ -1947,7 +1947,7 @@
         <w:spacing w:after="100"/>
       </w:pPr>
       <w:r>
-        <w:t>Descrierea rămâne sub 300 de cuvinte. Linkul Render și contribuțiile nominale se completează după verificare și confirmarea echipei.</w:t>
+        <w:t>Descrierea rămâne sub 300 de cuvinte. URL atribuit: https://fournext-study.onrender.com, încă în build. Contribuțiile nominale se confirmă cu echipa.</w:t>
       </w:r>
     </w:p>
     <w:p>
@@ -3204,12 +3204,12 @@
     </w:p>
     <w:p>
       <w:r>
-        <w:t>Coșul cu restaurare și expirare după cinci zile este implementat și testat. Auditul celor 30 de puncte păstrează alternativele și funcțiile lipsă. Starea deploymentului și merge-ul se verifică în README și în checklist; existența configurației nu dovedește o lansare reușită.</w:t>
+        <w:t>Coșul cu restaurare și expirare după cinci zile este implementat și testat. Auditul celor 30 de puncte păstrează alternativele și funcțiile lipsă. Sursa este publicată pe main; deploymentul Render este Live. Uploadul, generarea extractivă, citările, exporturile și fluxurile de bază au fost verificate pe serviciul cloud. Starea curentă și funcțiile încă lipsă sunt în README și checklist.</w:t>
       </w:r>
     </w:p>
     <w:p>
       <w:r>
-        <w:t>Echipa a ales explicit Render Free și a acceptat resetarea datelor. Contul demo se creează manual și poate necesita recreare după reset, fără parolă publicată în Git. Găzduirea Vercel cu API pe PC rămâne istoric; noul URL Render se anunță numai după verificarea serviciului.</w:t>
+        <w:t>Echipa a ales Render Free și a acceptat resetarea datelor. Contul demo se creează manual și poate necesita recreare după reset, fără parolă în Git. URL Live: https://fournext-study.onrender.com. Datele din Render Free pot fi resetate la restart sau redeploy; Vercel rămâne istoric.</w:t>
       </w:r>
     </w:p>
     <w:sectPr>

</xml_diff>

<commit_message>
fix: generate large study documents in resumable verified segments
</commit_message>
<xml_diff>
--- a/docs/4Next_document_de_lucru_hackathon.docx
+++ b/docs/4Next_document_de_lucru_hackathon.docx
@@ -32,7 +32,7 @@
         <w:rPr>
           <w:color w:val="000000"/>
         </w:rPr>
-        <w:t>Funcțiile actuale și pregătirea demonstrației din 17 octombrie 2026</w:t>
+        <w:t>Funcțiile actuale și verificarea demonstrației din 18 octombrie 2026</w:t>
       </w:r>
     </w:p>
     <w:tbl>
@@ -488,7 +488,7 @@
               <w:spacing w:after="40" w:line="252" w:lineRule="auto"/>
             </w:pPr>
             <w:r>
-              <w:t>Gemini este opțional și selectează fragmente din sursă. Aplicația verifică citatele exacte și afișează îndrumare pedagogică localizată. Fără serviciu disponibil, folosește extragere locală din documentul real, etichetată explicit.</w:t>
+              <w:t>Gemini generează explicații cu citări exacte și verificare independentă. Validarea reduce erorile, dar nu garantează corectitudinea pedagogică. Fără serviciu disponibil, folosește extragere locală din documentul real, etichetată explicit.</w:t>
             </w:r>
           </w:p>
         </w:tc>
@@ -796,8 +796,34 @@
         <w:spacing w:after="60"/>
         <w:ind w:left="317" w:hanging="173"/>
       </w:pPr>
+      <w:commentRangeStart w:id="0"/>
       <w:r>
-        <w:t>Sursa pregătită pentru Render a trecut 78/78 teste backend, cu 90% acoperire pentru codul activ, și 5/5 teste proxy frontend. Lint, TypeScript și build de producție trec. Generatoarele legacy video/diagrame sunt excluse explicit din acoperirea codului activ.</w:t>
+        <w:t>Auditul pornește de la 89 de teste backend și 5 teste proxy trecute. Rezultatele noii runde sunt în docs/audit_generare_segmentata.md. Lint, TypeScript și build de producție trec. Generatoarele legacy video/diagrame sunt excluse explicit din acoperirea codului activ.</w:t>
+      </w:r>
+      <w:commentRangeEnd w:id="0"/>
+      <w:r>
+        <w:rPr>
+          <w:rStyle w:val="CommentReference"/>
+        </w:rPr>
+        <w:commentReference w:id="0"/>
+      </w:r>
+    </w:p>
+    <w:p>
+      <w:pPr>
+        <w:pStyle w:val="ListBullet"/>
+        <w:spacing w:after="60"/>
+        <w:ind w:left="317" w:hanging="173"/>
+      </w:pPr>
+      <w:commentRangeStart w:id="1"/>
+      <w:r>
+        <w:t>Demo-ul Render Free este Live la https://fournext-study.onrender.com, cu versiunea b2579fc. Homepage-ul și health checkul au fost reverificate la 18 octombrie. Cazul PDF-ului de 127 de pagini necesită corecții suplimentare.</w:t>
+      </w:r>
+      <w:commentRangeEnd w:id="1"/>
+      <w:r>
+        <w:rPr>
+          <w:rStyle w:val="CommentReference"/>
+        </w:rPr>
+        <w:commentReference w:id="1"/>
       </w:r>
     </w:p>
     <w:p>
@@ -807,17 +833,7 @@
         <w:ind w:left="317" w:hanging="173"/>
       </w:pPr>
       <w:r>
-        <w:t>Vechiul demo Vercel a devenit indisponibil după sleep pe PC, astfel că echipa mută întreaga aplicație pe Render. URL-ul atribuit este https://fournext-study.onrender.com; deploymentul este încă în build, fără confirmare Live sau verificare publică.</w:t>
-      </w:r>
-    </w:p>
-    <w:p>
-      <w:pPr>
-        <w:pStyle w:val="ListBullet"/>
-        <w:spacing w:after="60"/>
-        <w:ind w:left="317" w:hanging="173"/>
-      </w:pPr>
-      <w:r>
-        <w:t>Configurația a trecut preview-ul Render, iar CI39066911100 a trecut backend, frontend și buildul Docker real cu smoke test pentru API, SQLite, catalog și PDF. Sursa este publicată pe main. Corecția proxyului permite până la 120 de secunde pentru analiză; redeployul și testul complet în cloud sunt în curs.</w:t>
+        <w:t>Configurația a trecut preview-ul Render, iar CI39066911100 a trecut backend, frontend și buildul Docker real cu smoke test pentru API, SQLite, catalog și PDF. Sursa este publicată pe main. Proxyul permite până la 120 de secunde per cerere. Noua procesare salvează separat fiecare segment; verificarea locală este distinctă de publicarea în cloud.</w:t>
       </w:r>
     </w:p>
     <w:p>
@@ -840,8 +856,16 @@
       <w:pPr>
         <w:widowControl/>
       </w:pPr>
+      <w:commentRangeStart w:id="2"/>
       <w:r>
-        <w:t>Coșul de gunoi cu restaurare, ștergere definitivă și expirare după cinci zile este implementat și testat. PDF-urile au fost reverificate. Serviciul Render Free este creat și se construiește, fără backend pe PC; URL-ul se distribuie după verificare.</w:t>
+        <w:t>Coșul de gunoi cu restaurare, ștergere definitivă și expirare după cinci zile este implementat și testat. PDF-urile au fost reverificate. Serviciul Render Free este Live, fără backend pe PC. Corecțiile noi se verifică înainte de publicare; starea lor este în raportul de audit.</w:t>
+      </w:r>
+      <w:commentRangeEnd w:id="2"/>
+      <w:r>
+        <w:rPr>
+          <w:rStyle w:val="CommentReference"/>
+        </w:rPr>
+        <w:commentReference w:id="2"/>
       </w:r>
     </w:p>
     <w:tbl>
@@ -1739,7 +1763,7 @@
               <w:spacing w:after="40" w:line="252" w:lineRule="auto"/>
             </w:pPr>
             <w:r>
-              <w:t>PyPDF2, python-docx, extracție EPUB/TXT/Markdown, langdetect și fpdf2 cu font Unicode. Edge TTS/gTTS sunt opționale; codul legacy Pillow/FFmpeg nu dovedește integrarea video curentă.</w:t>
+              <w:t>pdfplumber, python-docx, extracție EPUB/TXT/Markdown, langdetect și fpdf2 cu font Unicode. Edge TTS/gTTS sunt opționale; codul legacy Pillow/FFmpeg nu dovedește integrarea video curentă.</w:t>
             </w:r>
           </w:p>
         </w:tc>
@@ -1790,8 +1814,16 @@
             <w:pPr>
               <w:spacing w:after="40" w:line="252" w:lineRule="auto"/>
             </w:pPr>
+            <w:commentRangeStart w:id="3"/>
             <w:r>
-              <w:t>GitHub pentru cod și CI; sursa este integrată în main. Serviciu Render Free creat, cu deployment în build. Date temporare, fără disc. Canva rămâne etapa ulterioară.</w:t>
+              <w:t>GitHub pentru cod și CI; sursa este integrată în main. Serviciu Render Free Live, cu publicare manuală. Date temporare, fără disc. Canva rămâne etapa ulterioară.</w:t>
+            </w:r>
+            <w:commentRangeEnd w:id="3"/>
+            <w:r>
+              <w:rPr>
+                <w:rStyle w:val="CommentReference"/>
+              </w:rPr>
+              <w:commentReference w:id="3"/>
             </w:r>
           </w:p>
         </w:tc>
@@ -1855,7 +1887,7 @@
         <w:widowControl/>
       </w:pPr>
       <w:r>
-        <w:t>Serviciul Render Free din Frankfurt găzduiește Next.js public și FastAPI numai pe loopback 8000. Proxyul păstrează aceeași origine. Blueprintul folosește main și publicare manuală, fără disc sau plan cu plată. Cheia Gemini este configurată în Environment cu aprobarea utilizatorului; erorile furnizorului folosesc extragerea locală etichetată. Fluxul complet se verifică după redeploy.</w:t>
+        <w:t>Serviciul Render Free din Frankfurt găzduiește Next.js public și FastAPI numai pe loopback 8000. Proxyul păstrează aceeași origine. Blueprintul folosește main și publicare manuală, fără disc sau plan cu plată. Cheia Gemini este configurată în Environment cu aprobarea utilizatorului; erorile furnizorului folosesc extragerea locală etichetată. Corecțiile pentru PDF-uri mari se verifică separat înainte de redeploy.</w:t>
       </w:r>
     </w:p>
     <w:p>
@@ -1947,7 +1979,7 @@
         <w:spacing w:after="100"/>
       </w:pPr>
       <w:r>
-        <w:t>Descrierea rămâne sub 300 de cuvinte. URL atribuit: https://fournext-study.onrender.com, încă în build. Contribuțiile nominale se confirmă cu echipa.</w:t>
+        <w:t>Descrierea rămâne sub 300 de cuvinte. URL public verificat: https://fournext-study.onrender.com. Starea versiunii noi este în raportul de audit. Contribuțiile nominale se confirmă cu echipa.</w:t>
       </w:r>
     </w:p>
     <w:p>
@@ -3223,6 +3255,75 @@
 </w:document>
 </file>
 
+<file path=word/comments.xml><?xml version="1.0" encoding="utf-8"?>
+<w:comments xmlns:a="http://schemas.openxmlformats.org/drawingml/2006/main" xmlns:pic="http://schemas.openxmlformats.org/drawingml/2006/picture" xmlns:r="http://schemas.openxmlformats.org/officeDocument/2006/relationships" xmlns:w="http://schemas.openxmlformats.org/wordprocessingml/2006/main" xmlns:wp="http://schemas.openxmlformats.org/drawingml/2006/wordprocessingDrawing" xmlns:mc="http://schemas.openxmlformats.org/markup-compatibility/2006" xmlns:a14="http://schemas.microsoft.com/office/drawing/2010/main" xmlns:w14="http://schemas.microsoft.com/office/word/2010/wordml" xmlns:wpc="http://schemas.microsoft.com/office/word/2010/wordprocessingCanvas">
+  <w:comment w:id="0" w:author="4Next" w:initials="" w:date="2026-10-18T10:05:03Z">
+    <w:p>
+      <w:pPr>
+        <w:pStyle w:val="CommentText"/>
+      </w:pPr>
+      <w:r>
+        <w:rPr>
+          <w:rStyle w:val="CommentReference"/>
+        </w:rPr>
+        <w:annotationRef/>
+      </w:r>
+      <w:r>
+        <w:t>Actualizare din auditul din 18 octombrie: separăm versiunea Live de modificările validate local. Raport: docs/audit_generare_segmentata.md.</w:t>
+      </w:r>
+    </w:p>
+  </w:comment>
+  <w:comment w:id="1" w:author="4Next" w:initials="" w:date="2026-10-18T10:05:03Z">
+    <w:p>
+      <w:pPr>
+        <w:pStyle w:val="CommentText"/>
+      </w:pPr>
+      <w:r>
+        <w:rPr>
+          <w:rStyle w:val="CommentReference"/>
+        </w:rPr>
+        <w:annotationRef/>
+      </w:r>
+      <w:r>
+        <w:t>Actualizare din auditul din 18 octombrie: separăm versiunea Live de modificările validate local. Raport: docs/audit_generare_segmentata.md.</w:t>
+      </w:r>
+    </w:p>
+  </w:comment>
+  <w:comment w:id="2" w:author="4Next" w:initials="" w:date="2026-10-18T10:05:03Z">
+    <w:p>
+      <w:pPr>
+        <w:pStyle w:val="CommentText"/>
+      </w:pPr>
+      <w:r>
+        <w:rPr>
+          <w:rStyle w:val="CommentReference"/>
+        </w:rPr>
+        <w:annotationRef/>
+      </w:r>
+      <w:r>
+        <w:t>Actualizare din auditul din 18 octombrie: separăm versiunea Live de modificările validate local. Raport: docs/audit_generare_segmentata.md.</w:t>
+      </w:r>
+    </w:p>
+  </w:comment>
+  <w:comment w:id="3" w:author="4Next" w:initials="" w:date="2026-10-18T10:05:03Z">
+    <w:p>
+      <w:pPr>
+        <w:pStyle w:val="CommentText"/>
+      </w:pPr>
+      <w:r>
+        <w:rPr>
+          <w:rStyle w:val="CommentReference"/>
+        </w:rPr>
+        <w:annotationRef/>
+      </w:r>
+      <w:r>
+        <w:t>Actualizare din auditul din 18 octombrie: separăm versiunea Live de modificările validate local. Raport: docs/audit_generare_segmentata.md.</w:t>
+      </w:r>
+    </w:p>
+  </w:comment>
+</w:comments>
+</file>
+
 <file path=word/footer1.xml><?xml version="1.0" encoding="utf-8"?>
 <w:ftr xmlns:m="http://schemas.openxmlformats.org/officeDocument/2006/math" xmlns:mc="http://schemas.openxmlformats.org/markup-compatibility/2006" xmlns:mo="http://schemas.microsoft.com/office/mac/office/2008/main" xmlns:mv="urn:schemas-microsoft-com:mac:vml" xmlns:o="urn:schemas-microsoft-com:office:office" xmlns:r="http://schemas.openxmlformats.org/officeDocument/2006/relationships" xmlns:v="urn:schemas-microsoft-com:vml" xmlns:w10="urn:schemas-microsoft-com:office:word" xmlns:w14="http://schemas.microsoft.com/office/word/2010/wordml" xmlns:w="http://schemas.openxmlformats.org/wordprocessingml/2006/main" xmlns:wne="http://schemas.microsoft.com/office/word/2006/wordml" xmlns:wp14="http://schemas.microsoft.com/office/word/2010/wordprocessingDrawing" xmlns:wp="http://schemas.openxmlformats.org/drawingml/2006/wordprocessingDrawing" xmlns:wpc="http://schemas.microsoft.com/office/word/2010/wordprocessingCanvas" xmlns:wpg="http://schemas.microsoft.com/office/word/2010/wordprocessingGroup" xmlns:wpi="http://schemas.microsoft.com/office/word/2010/wordprocessingInk" xmlns:wps="http://schemas.microsoft.com/office/word/2010/wordprocessingShape" mc:Ignorable="w14 wp14">
   <w:p>

</xml_diff>